<commit_message>
v4 adds 9th essential transition
</commit_message>
<xml_diff>
--- a/corpus/DN_Understanding_Dimensional_Transitions.docx
+++ b/corpus/DN_Understanding_Dimensional_Transitions.docx
@@ -10,6 +10,7 @@
         <w:spacing w:before="480" w:lineRule="auto"/>
         <w:rPr>
           <w:b w:val="1"/>
+          <w:bCs w:val="1"/>
           <w:sz w:val="46"/>
           <w:szCs w:val="46"/>
         </w:rPr>
@@ -19,6 +20,7 @@
       <w:r>
         <w:rPr>
           <w:b w:val="1"/>
+          <w:bCs w:val="1"/>
           <w:sz w:val="46"/>
           <w:szCs w:val="46"/>
           <w:rtl w:val="0"/>
@@ -36,6 +38,7 @@
         <w:spacing w:after="80" w:lineRule="auto"/>
         <w:rPr>
           <w:b w:val="1"/>
+          <w:bCs w:val="1"/>
           <w:sz w:val="34"/>
           <w:szCs w:val="34"/>
         </w:rPr>
@@ -45,6 +48,7 @@
       <w:r>
         <w:rPr>
           <w:b w:val="1"/>
+          <w:bCs w:val="1"/>
           <w:sz w:val="34"/>
           <w:szCs w:val="34"/>
           <w:rtl w:val="0"/>
@@ -74,6 +78,7 @@
         <w:spacing w:after="80" w:lineRule="auto"/>
         <w:rPr>
           <w:b w:val="1"/>
+          <w:bCs w:val="1"/>
           <w:sz w:val="34"/>
           <w:szCs w:val="34"/>
         </w:rPr>
@@ -83,6 +88,7 @@
       <w:r>
         <w:rPr>
           <w:b w:val="1"/>
+          <w:bCs w:val="1"/>
           <w:sz w:val="34"/>
           <w:szCs w:val="34"/>
           <w:rtl w:val="0"/>
@@ -110,6 +116,7 @@
         <w:spacing w:before="280" w:lineRule="auto"/>
         <w:rPr>
           <w:b w:val="1"/>
+          <w:bCs w:val="1"/>
           <w:color w:val="000000"/>
           <w:sz w:val="26"/>
           <w:szCs w:val="26"/>
@@ -120,6 +127,7 @@
       <w:r>
         <w:rPr>
           <w:b w:val="1"/>
+          <w:bCs w:val="1"/>
           <w:color w:val="000000"/>
           <w:sz w:val="26"/>
           <w:szCs w:val="26"/>
@@ -157,6 +165,7 @@
         <w:rPr>
           <w:rFonts w:ascii="Arial Unicode MS" w:cs="Arial Unicode MS" w:eastAsia="Arial Unicode MS" w:hAnsi="Arial Unicode MS"/>
           <w:b w:val="1"/>
+          <w:bCs w:val="1"/>
           <w:rtl w:val="0"/>
         </w:rPr>
         <w:t xml:space="preserve">Lower Transitions (1D→4D)</w:t>
@@ -184,6 +193,7 @@
         <w:rPr>
           <w:rFonts w:ascii="Arial Unicode MS" w:cs="Arial Unicode MS" w:eastAsia="Arial Unicode MS" w:hAnsi="Arial Unicode MS"/>
           <w:b w:val="1"/>
+          <w:bCs w:val="1"/>
           <w:rtl w:val="0"/>
         </w:rPr>
         <w:t xml:space="preserve">Middle Transitions (4D→6D)</w:t>
@@ -211,6 +221,7 @@
         <w:rPr>
           <w:rFonts w:ascii="Arial Unicode MS" w:cs="Arial Unicode MS" w:eastAsia="Arial Unicode MS" w:hAnsi="Arial Unicode MS"/>
           <w:b w:val="1"/>
+          <w:bCs w:val="1"/>
           <w:rtl w:val="0"/>
         </w:rPr>
         <w:t xml:space="preserve">Higher Transitions (6D→9D)</w:t>
@@ -242,6 +253,7 @@
         <w:spacing w:before="280" w:lineRule="auto"/>
         <w:rPr>
           <w:b w:val="1"/>
+          <w:bCs w:val="1"/>
           <w:color w:val="000000"/>
           <w:sz w:val="26"/>
           <w:szCs w:val="26"/>
@@ -263,6 +275,7 @@
         <w:spacing w:before="280" w:lineRule="auto"/>
         <w:rPr>
           <w:b w:val="1"/>
+          <w:bCs w:val="1"/>
           <w:color w:val="000000"/>
           <w:sz w:val="26"/>
           <w:szCs w:val="26"/>
@@ -274,6 +287,7 @@
         <w:rPr>
           <w:rFonts w:ascii="Arial Unicode MS" w:cs="Arial Unicode MS" w:eastAsia="Arial Unicode MS" w:hAnsi="Arial Unicode MS"/>
           <w:b w:val="1"/>
+          <w:bCs w:val="1"/>
           <w:color w:val="000000"/>
           <w:sz w:val="26"/>
           <w:szCs w:val="26"/>
@@ -309,6 +323,7 @@
       <w:r>
         <w:rPr>
           <w:b w:val="1"/>
+          <w:bCs w:val="1"/>
           <w:rtl w:val="0"/>
         </w:rPr>
         <w:t xml:space="preserve">Understanding</w:t>
@@ -335,6 +350,7 @@
       <w:r>
         <w:rPr>
           <w:b w:val="1"/>
+          <w:bCs w:val="1"/>
           <w:rtl w:val="0"/>
         </w:rPr>
         <w:t xml:space="preserve">Sharing</w:t>
@@ -361,6 +377,7 @@
       <w:r>
         <w:rPr>
           <w:b w:val="1"/>
+          <w:bCs w:val="1"/>
           <w:rtl w:val="0"/>
         </w:rPr>
         <w:t xml:space="preserve">Expansion</w:t>
@@ -410,6 +427,7 @@
         <w:spacing w:after="240" w:before="240" w:lineRule="auto"/>
         <w:rPr>
           <w:b w:val="1"/>
+          <w:bCs w:val="1"/>
           <w:sz w:val="34"/>
           <w:szCs w:val="34"/>
         </w:rPr>
@@ -417,11 +435,12 @@
       <w:r>
         <w:rPr>
           <w:b w:val="1"/>
+          <w:bCs w:val="1"/>
           <w:sz w:val="34"/>
           <w:szCs w:val="34"/>
           <w:rtl w:val="0"/>
         </w:rPr>
-        <w:t xml:space="preserve">The Eight Essential Transitions</w:t>
+        <w:t xml:space="preserve">The Nine Essential Transitions</w:t>
       </w:r>
     </w:p>
     <w:p>
@@ -432,6 +451,7 @@
         <w:spacing w:before="280" w:lineRule="auto"/>
         <w:rPr>
           <w:b w:val="1"/>
+          <w:bCs w:val="1"/>
           <w:color w:val="000000"/>
           <w:sz w:val="26"/>
           <w:szCs w:val="26"/>
@@ -443,6 +463,7 @@
         <w:rPr>
           <w:rFonts w:ascii="Arial Unicode MS" w:cs="Arial Unicode MS" w:eastAsia="Arial Unicode MS" w:hAnsi="Arial Unicode MS"/>
           <w:b w:val="1"/>
+          <w:bCs w:val="1"/>
           <w:color w:val="000000"/>
           <w:sz w:val="26"/>
           <w:szCs w:val="26"/>
@@ -456,11 +477,13 @@
         <w:spacing w:after="240" w:before="240" w:lineRule="auto"/>
         <w:rPr>
           <w:b w:val="1"/>
-        </w:rPr>
-      </w:pPr>
-      <w:r>
-        <w:rPr>
-          <w:b w:val="1"/>
+          <w:bCs w:val="1"/>
+        </w:rPr>
+      </w:pPr>
+      <w:r>
+        <w:rPr>
+          <w:b w:val="1"/>
+          <w:bCs w:val="1"/>
           <w:rtl w:val="0"/>
         </w:rPr>
         <w:t xml:space="preserve">The Heart Meets Reality</w:t>
@@ -486,6 +509,7 @@
       <w:r>
         <w:rPr>
           <w:b w:val="1"/>
+          <w:bCs w:val="1"/>
           <w:rtl w:val="0"/>
         </w:rPr>
         <w:t xml:space="preserve">Example:</w:t>
@@ -505,6 +529,7 @@
       <w:r>
         <w:rPr>
           <w:b w:val="1"/>
+          <w:bCs w:val="1"/>
           <w:rtl w:val="0"/>
         </w:rPr>
         <w:t xml:space="preserve">Key Mechanism:</w:t>
@@ -524,6 +549,7 @@
       <w:r>
         <w:rPr>
           <w:b w:val="1"/>
+          <w:bCs w:val="1"/>
           <w:rtl w:val="0"/>
         </w:rPr>
         <w:t xml:space="preserve">Common Barrier:</w:t>
@@ -543,6 +569,7 @@
         <w:spacing w:before="280" w:lineRule="auto"/>
         <w:rPr>
           <w:b w:val="1"/>
+          <w:bCs w:val="1"/>
           <w:color w:val="000000"/>
           <w:sz w:val="26"/>
           <w:szCs w:val="26"/>
@@ -564,6 +591,7 @@
         <w:spacing w:before="280" w:lineRule="auto"/>
         <w:rPr>
           <w:b w:val="1"/>
+          <w:bCs w:val="1"/>
           <w:color w:val="000000"/>
           <w:sz w:val="26"/>
           <w:szCs w:val="26"/>
@@ -575,6 +603,7 @@
         <w:rPr>
           <w:rFonts w:ascii="Arial Unicode MS" w:cs="Arial Unicode MS" w:eastAsia="Arial Unicode MS" w:hAnsi="Arial Unicode MS"/>
           <w:b w:val="1"/>
+          <w:bCs w:val="1"/>
           <w:color w:val="000000"/>
           <w:sz w:val="26"/>
           <w:szCs w:val="26"/>
@@ -588,11 +617,13 @@
         <w:spacing w:after="240" w:before="240" w:lineRule="auto"/>
         <w:rPr>
           <w:b w:val="1"/>
-        </w:rPr>
-      </w:pPr>
-      <w:r>
-        <w:rPr>
-          <w:b w:val="1"/>
+          <w:bCs w:val="1"/>
+        </w:rPr>
+      </w:pPr>
+      <w:r>
+        <w:rPr>
+          <w:b w:val="1"/>
+          <w:bCs w:val="1"/>
           <w:rtl w:val="0"/>
         </w:rPr>
         <w:t xml:space="preserve">Connecting the Dots</w:t>
@@ -618,6 +649,7 @@
       <w:r>
         <w:rPr>
           <w:b w:val="1"/>
+          <w:bCs w:val="1"/>
           <w:rtl w:val="0"/>
         </w:rPr>
         <w:t xml:space="preserve">Example:</w:t>
@@ -637,6 +669,7 @@
       <w:r>
         <w:rPr>
           <w:b w:val="1"/>
+          <w:bCs w:val="1"/>
           <w:rtl w:val="0"/>
         </w:rPr>
         <w:t xml:space="preserve">Key Mechanism:</w:t>
@@ -656,6 +689,7 @@
       <w:r>
         <w:rPr>
           <w:b w:val="1"/>
+          <w:bCs w:val="1"/>
           <w:rtl w:val="0"/>
         </w:rPr>
         <w:t xml:space="preserve">Common Barrier:</w:t>
@@ -675,6 +709,7 @@
         <w:spacing w:before="280" w:lineRule="auto"/>
         <w:rPr>
           <w:b w:val="1"/>
+          <w:bCs w:val="1"/>
           <w:color w:val="000000"/>
           <w:sz w:val="26"/>
           <w:szCs w:val="26"/>
@@ -696,6 +731,7 @@
         <w:spacing w:before="280" w:lineRule="auto"/>
         <w:rPr>
           <w:b w:val="1"/>
+          <w:bCs w:val="1"/>
           <w:color w:val="000000"/>
           <w:sz w:val="26"/>
           <w:szCs w:val="26"/>
@@ -707,6 +743,7 @@
         <w:rPr>
           <w:rFonts w:ascii="Arial Unicode MS" w:cs="Arial Unicode MS" w:eastAsia="Arial Unicode MS" w:hAnsi="Arial Unicode MS"/>
           <w:b w:val="1"/>
+          <w:bCs w:val="1"/>
           <w:color w:val="000000"/>
           <w:sz w:val="26"/>
           <w:szCs w:val="26"/>
@@ -720,11 +757,13 @@
         <w:spacing w:after="240" w:before="240" w:lineRule="auto"/>
         <w:rPr>
           <w:b w:val="1"/>
-        </w:rPr>
-      </w:pPr>
-      <w:r>
-        <w:rPr>
-          <w:b w:val="1"/>
+          <w:bCs w:val="1"/>
+        </w:rPr>
+      </w:pPr>
+      <w:r>
+        <w:rPr>
+          <w:b w:val="1"/>
+          <w:bCs w:val="1"/>
           <w:rtl w:val="0"/>
         </w:rPr>
         <w:t xml:space="preserve">Adding Time to the Equation</w:t>
@@ -750,6 +789,7 @@
       <w:r>
         <w:rPr>
           <w:b w:val="1"/>
+          <w:bCs w:val="1"/>
           <w:rtl w:val="0"/>
         </w:rPr>
         <w:t xml:space="preserve">Example:</w:t>
@@ -769,6 +809,7 @@
       <w:r>
         <w:rPr>
           <w:b w:val="1"/>
+          <w:bCs w:val="1"/>
           <w:rtl w:val="0"/>
         </w:rPr>
         <w:t xml:space="preserve">Key Mechanism:</w:t>
@@ -788,6 +829,7 @@
       <w:r>
         <w:rPr>
           <w:b w:val="1"/>
+          <w:bCs w:val="1"/>
           <w:rtl w:val="0"/>
         </w:rPr>
         <w:t xml:space="preserve">Common Barrier:</w:t>
@@ -807,6 +849,7 @@
         <w:spacing w:before="280" w:lineRule="auto"/>
         <w:rPr>
           <w:b w:val="1"/>
+          <w:bCs w:val="1"/>
           <w:color w:val="000000"/>
           <w:sz w:val="26"/>
           <w:szCs w:val="26"/>
@@ -828,6 +871,7 @@
         <w:spacing w:before="280" w:lineRule="auto"/>
         <w:rPr>
           <w:b w:val="1"/>
+          <w:bCs w:val="1"/>
           <w:color w:val="000000"/>
           <w:sz w:val="26"/>
           <w:szCs w:val="26"/>
@@ -839,6 +883,7 @@
         <w:rPr>
           <w:rFonts w:ascii="Arial Unicode MS" w:cs="Arial Unicode MS" w:eastAsia="Arial Unicode MS" w:hAnsi="Arial Unicode MS"/>
           <w:b w:val="1"/>
+          <w:bCs w:val="1"/>
           <w:color w:val="000000"/>
           <w:sz w:val="26"/>
           <w:szCs w:val="26"/>
@@ -852,11 +897,13 @@
         <w:spacing w:after="240" w:before="240" w:lineRule="auto"/>
         <w:rPr>
           <w:b w:val="1"/>
-        </w:rPr>
-      </w:pPr>
-      <w:r>
-        <w:rPr>
-          <w:b w:val="1"/>
+          <w:bCs w:val="1"/>
+        </w:rPr>
+      </w:pPr>
+      <w:r>
+        <w:rPr>
+          <w:b w:val="1"/>
+          <w:bCs w:val="1"/>
           <w:rtl w:val="0"/>
         </w:rPr>
         <w:t xml:space="preserve">Collapsing Possibilities into Reality</w:t>
@@ -882,6 +929,7 @@
       <w:r>
         <w:rPr>
           <w:b w:val="1"/>
+          <w:bCs w:val="1"/>
           <w:rtl w:val="0"/>
         </w:rPr>
         <w:t xml:space="preserve">Example:</w:t>
@@ -901,6 +949,7 @@
       <w:r>
         <w:rPr>
           <w:b w:val="1"/>
+          <w:bCs w:val="1"/>
           <w:rtl w:val="0"/>
         </w:rPr>
         <w:t xml:space="preserve">Key Mechanism:</w:t>
@@ -920,6 +969,7 @@
       <w:r>
         <w:rPr>
           <w:b w:val="1"/>
+          <w:bCs w:val="1"/>
           <w:rtl w:val="0"/>
         </w:rPr>
         <w:t xml:space="preserve">Common Barrier:</w:t>
@@ -939,6 +989,7 @@
         <w:spacing w:before="280" w:lineRule="auto"/>
         <w:rPr>
           <w:b w:val="1"/>
+          <w:bCs w:val="1"/>
           <w:color w:val="000000"/>
           <w:sz w:val="26"/>
           <w:szCs w:val="26"/>
@@ -960,6 +1011,7 @@
         <w:spacing w:before="280" w:lineRule="auto"/>
         <w:rPr>
           <w:b w:val="1"/>
+          <w:bCs w:val="1"/>
           <w:color w:val="000000"/>
           <w:sz w:val="26"/>
           <w:szCs w:val="26"/>
@@ -971,6 +1023,7 @@
         <w:rPr>
           <w:rFonts w:ascii="Arial Unicode MS" w:cs="Arial Unicode MS" w:eastAsia="Arial Unicode MS" w:hAnsi="Arial Unicode MS"/>
           <w:b w:val="1"/>
+          <w:bCs w:val="1"/>
           <w:color w:val="000000"/>
           <w:sz w:val="26"/>
           <w:szCs w:val="26"/>
@@ -984,11 +1037,13 @@
         <w:spacing w:after="240" w:before="240" w:lineRule="auto"/>
         <w:rPr>
           <w:b w:val="1"/>
-        </w:rPr>
-      </w:pPr>
-      <w:r>
-        <w:rPr>
-          <w:b w:val="1"/>
+          <w:bCs w:val="1"/>
+        </w:rPr>
+      </w:pPr>
+      <w:r>
+        <w:rPr>
+          <w:b w:val="1"/>
+          <w:bCs w:val="1"/>
           <w:rtl w:val="0"/>
         </w:rPr>
         <w:t xml:space="preserve">Building Bridges Between Worlds</w:t>
@@ -1094,6 +1149,7 @@
       <w:r>
         <w:rPr>
           <w:b w:val="1"/>
+          <w:bCs w:val="1"/>
           <w:rtl w:val="0"/>
         </w:rPr>
         <w:t xml:space="preserve">Example</w:t>
@@ -1113,6 +1169,7 @@
       <w:r>
         <w:rPr>
           <w:b w:val="1"/>
+          <w:bCs w:val="1"/>
           <w:rtl w:val="0"/>
         </w:rPr>
         <w:t xml:space="preserve">Example:</w:t>
@@ -1132,6 +1189,7 @@
       <w:r>
         <w:rPr>
           <w:b w:val="1"/>
+          <w:bCs w:val="1"/>
           <w:rtl w:val="0"/>
         </w:rPr>
         <w:t xml:space="preserve">Key Mechanism:</w:t>
@@ -1151,6 +1209,7 @@
       <w:r>
         <w:rPr>
           <w:b w:val="1"/>
+          <w:bCs w:val="1"/>
           <w:rtl w:val="0"/>
         </w:rPr>
         <w:t xml:space="preserve">Common Barrier:</w:t>
@@ -1170,6 +1229,7 @@
         <w:spacing w:before="280" w:lineRule="auto"/>
         <w:rPr>
           <w:b w:val="1"/>
+          <w:bCs w:val="1"/>
           <w:color w:val="000000"/>
           <w:sz w:val="26"/>
           <w:szCs w:val="26"/>
@@ -1191,6 +1251,7 @@
         <w:spacing w:before="280" w:lineRule="auto"/>
         <w:rPr>
           <w:b w:val="1"/>
+          <w:bCs w:val="1"/>
           <w:color w:val="000000"/>
           <w:sz w:val="26"/>
           <w:szCs w:val="26"/>
@@ -1202,6 +1263,7 @@
         <w:rPr>
           <w:rFonts w:ascii="Arial Unicode MS" w:cs="Arial Unicode MS" w:eastAsia="Arial Unicode MS" w:hAnsi="Arial Unicode MS"/>
           <w:b w:val="1"/>
+          <w:bCs w:val="1"/>
           <w:color w:val="000000"/>
           <w:sz w:val="26"/>
           <w:szCs w:val="26"/>
@@ -1215,11 +1277,13 @@
         <w:spacing w:after="240" w:before="240" w:lineRule="auto"/>
         <w:rPr>
           <w:b w:val="1"/>
-        </w:rPr>
-      </w:pPr>
-      <w:r>
-        <w:rPr>
-          <w:b w:val="1"/>
+          <w:bCs w:val="1"/>
+        </w:rPr>
+      </w:pPr>
+      <w:r>
+        <w:rPr>
+          <w:b w:val="1"/>
+          <w:bCs w:val="1"/>
           <w:rtl w:val="0"/>
         </w:rPr>
         <w:t xml:space="preserve">Manifesting New Realities</w:t>
@@ -1325,6 +1389,7 @@
       <w:r>
         <w:rPr>
           <w:b w:val="1"/>
+          <w:bCs w:val="1"/>
           <w:rtl w:val="0"/>
         </w:rPr>
         <w:t xml:space="preserve">Example</w:t>
@@ -1344,6 +1409,7 @@
       <w:r>
         <w:rPr>
           <w:b w:val="1"/>
+          <w:bCs w:val="1"/>
           <w:rtl w:val="0"/>
         </w:rPr>
         <w:t xml:space="preserve">Example:</w:t>
@@ -1363,6 +1429,7 @@
       <w:r>
         <w:rPr>
           <w:b w:val="1"/>
+          <w:bCs w:val="1"/>
           <w:rtl w:val="0"/>
         </w:rPr>
         <w:t xml:space="preserve">Key Mechanism:</w:t>
@@ -1382,6 +1449,7 @@
       <w:r>
         <w:rPr>
           <w:b w:val="1"/>
+          <w:bCs w:val="1"/>
           <w:rtl w:val="0"/>
         </w:rPr>
         <w:t xml:space="preserve">Common Barrier:</w:t>
@@ -1401,6 +1469,7 @@
         <w:spacing w:before="280" w:lineRule="auto"/>
         <w:rPr>
           <w:b w:val="1"/>
+          <w:bCs w:val="1"/>
           <w:color w:val="000000"/>
           <w:sz w:val="26"/>
           <w:szCs w:val="26"/>
@@ -1422,6 +1491,7 @@
         <w:spacing w:before="280" w:lineRule="auto"/>
         <w:rPr>
           <w:b w:val="1"/>
+          <w:bCs w:val="1"/>
           <w:color w:val="000000"/>
           <w:sz w:val="26"/>
           <w:szCs w:val="26"/>
@@ -1433,6 +1503,7 @@
         <w:rPr>
           <w:rFonts w:ascii="Arial Unicode MS" w:cs="Arial Unicode MS" w:eastAsia="Arial Unicode MS" w:hAnsi="Arial Unicode MS"/>
           <w:b w:val="1"/>
+          <w:bCs w:val="1"/>
           <w:color w:val="000000"/>
           <w:sz w:val="26"/>
           <w:szCs w:val="26"/>
@@ -1446,11 +1517,13 @@
         <w:spacing w:after="240" w:before="240" w:lineRule="auto"/>
         <w:rPr>
           <w:b w:val="1"/>
-        </w:rPr>
-      </w:pPr>
-      <w:r>
-        <w:rPr>
-          <w:b w:val="1"/>
+          <w:bCs w:val="1"/>
+        </w:rPr>
+      </w:pPr>
+      <w:r>
+        <w:rPr>
+          <w:b w:val="1"/>
+          <w:bCs w:val="1"/>
           <w:rtl w:val="0"/>
         </w:rPr>
         <w:t xml:space="preserve">Building Self-Improving Systems</w:t>
@@ -1556,6 +1629,7 @@
       <w:r>
         <w:rPr>
           <w:b w:val="1"/>
+          <w:bCs w:val="1"/>
           <w:rtl w:val="0"/>
         </w:rPr>
         <w:t xml:space="preserve">Example</w:t>
@@ -1575,6 +1649,7 @@
       <w:r>
         <w:rPr>
           <w:b w:val="1"/>
+          <w:bCs w:val="1"/>
           <w:rtl w:val="0"/>
         </w:rPr>
         <w:t xml:space="preserve">Example:</w:t>
@@ -1594,6 +1669,7 @@
       <w:r>
         <w:rPr>
           <w:b w:val="1"/>
+          <w:bCs w:val="1"/>
           <w:rtl w:val="0"/>
         </w:rPr>
         <w:t xml:space="preserve">Key Mechanism:</w:t>
@@ -1613,6 +1689,7 @@
       <w:r>
         <w:rPr>
           <w:b w:val="1"/>
+          <w:bCs w:val="1"/>
           <w:rtl w:val="0"/>
         </w:rPr>
         <w:t xml:space="preserve">Common Barrier:</w:t>
@@ -1632,6 +1709,7 @@
         <w:spacing w:before="280" w:lineRule="auto"/>
         <w:rPr>
           <w:b w:val="1"/>
+          <w:bCs w:val="1"/>
           <w:color w:val="000000"/>
           <w:sz w:val="26"/>
           <w:szCs w:val="26"/>
@@ -1653,6 +1731,7 @@
         <w:spacing w:before="280" w:lineRule="auto"/>
         <w:rPr>
           <w:b w:val="1"/>
+          <w:bCs w:val="1"/>
           <w:color w:val="000000"/>
           <w:sz w:val="26"/>
           <w:szCs w:val="26"/>
@@ -1664,6 +1743,7 @@
         <w:rPr>
           <w:rFonts w:ascii="Arial Unicode MS" w:cs="Arial Unicode MS" w:eastAsia="Arial Unicode MS" w:hAnsi="Arial Unicode MS"/>
           <w:b w:val="1"/>
+          <w:bCs w:val="1"/>
           <w:color w:val="000000"/>
           <w:sz w:val="26"/>
           <w:szCs w:val="26"/>
@@ -1677,11 +1757,13 @@
         <w:spacing w:after="240" w:before="240" w:lineRule="auto"/>
         <w:rPr>
           <w:b w:val="1"/>
-        </w:rPr>
-      </w:pPr>
-      <w:r>
-        <w:rPr>
-          <w:b w:val="1"/>
+          <w:bCs w:val="1"/>
+        </w:rPr>
+      </w:pPr>
+      <w:r>
+        <w:rPr>
+          <w:b w:val="1"/>
+          <w:bCs w:val="1"/>
           <w:rtl w:val="0"/>
         </w:rPr>
         <w:t xml:space="preserve">Entering Uncharted Territory</w:t>
@@ -1696,17 +1778,18 @@
         <w:rPr>
           <w:rtl w:val="0"/>
         </w:rPr>
-        <w:t xml:space="preserve">The final transition ventures beyond established frameworks into genuine exploration of the unknown.</w:t>
-      </w:r>
-    </w:p>
-    <w:p>
-      <w:pPr>
-        <w:spacing w:after="240" w:before="240" w:lineRule="auto"/>
-        <w:rPr/>
-      </w:pPr>
-      <w:r>
-        <w:rPr>
-          <w:b w:val="1"/>
+        <w:t xml:space="preserve">This transition ventures beyond established frameworks into genuine exploration of the unknown.</w:t>
+      </w:r>
+    </w:p>
+    <w:p>
+      <w:pPr>
+        <w:spacing w:after="240" w:before="240" w:lineRule="auto"/>
+        <w:rPr/>
+      </w:pPr>
+      <w:r>
+        <w:rPr>
+          <w:b w:val="1"/>
+          <w:bCs w:val="1"/>
           <w:rtl w:val="0"/>
         </w:rPr>
         <w:t xml:space="preserve">Example:</w:t>
@@ -1726,6 +1809,7 @@
       <w:r>
         <w:rPr>
           <w:b w:val="1"/>
+          <w:bCs w:val="1"/>
           <w:rtl w:val="0"/>
         </w:rPr>
         <w:t xml:space="preserve">Key Mechanism:</w:t>
@@ -1745,6 +1829,7 @@
       <w:r>
         <w:rPr>
           <w:b w:val="1"/>
+          <w:bCs w:val="1"/>
           <w:rtl w:val="0"/>
         </w:rPr>
         <w:t xml:space="preserve">Common Barrier:</w:t>
@@ -1754,6 +1839,173 @@
           <w:rtl w:val="0"/>
         </w:rPr>
         <w:t xml:space="preserve"> Security-seeking that keeps exploration within safe, familiar boundaries.</w:t>
+      </w:r>
+    </w:p>
+    <w:p>
+      <w:pPr>
+        <w:rPr/>
+      </w:pPr>
+      <w:r>
+        <w:rPr>
+          <w:rtl w:val="0"/>
+        </w:rPr>
+      </w:r>
+    </w:p>
+    <w:p>
+      <w:pPr>
+        <w:pStyle w:val="Heading3"/>
+        <w:rPr>
+          <w:b w:val="1"/>
+          <w:bCs w:val="1"/>
+        </w:rPr>
+      </w:pPr>
+      <w:bookmarkStart w:colFirst="0" w:colLast="0" w:name="_tpw7k5j1g2qt" w:id="21"/>
+      <w:bookmarkEnd w:id="21"/>
+      <w:r>
+        <w:rPr>
+          <w:rFonts w:ascii="Arial Unicode MS" w:cs="Arial Unicode MS" w:eastAsia="Arial Unicode MS" w:hAnsi="Arial Unicode MS"/>
+          <w:b w:val="1"/>
+          <w:bCs w:val="1"/>
+          <w:rtl w:val="0"/>
+        </w:rPr>
+        <w:t xml:space="preserve">9D→1D: From Mystery to Renewed Origin</w:t>
+      </w:r>
+    </w:p>
+    <w:p>
+      <w:pPr>
+        <w:rPr/>
+      </w:pPr>
+      <w:r>
+        <w:rPr>
+          <w:rtl w:val="0"/>
+        </w:rPr>
+      </w:r>
+    </w:p>
+    <w:p>
+      <w:pPr>
+        <w:rPr>
+          <w:b w:val="1"/>
+          <w:bCs w:val="1"/>
+        </w:rPr>
+      </w:pPr>
+      <w:r>
+        <w:rPr>
+          <w:b w:val="1"/>
+          <w:bCs w:val="1"/>
+          <w:rtl w:val="0"/>
+        </w:rPr>
+        <w:t xml:space="preserve">The Cycle Completes</w:t>
+      </w:r>
+    </w:p>
+    <w:p>
+      <w:pPr>
+        <w:rPr>
+          <w:b w:val="1"/>
+          <w:bCs w:val="1"/>
+        </w:rPr>
+      </w:pPr>
+      <w:r>
+        <w:rPr>
+          <w:rtl w:val="0"/>
+        </w:rPr>
+      </w:r>
+    </w:p>
+    <w:p>
+      <w:pPr>
+        <w:rPr/>
+      </w:pPr>
+      <w:r>
+        <w:rPr>
+          <w:rtl w:val="0"/>
+        </w:rPr>
+        <w:t xml:space="preserve">The progression is cyclic: 9D frontier engagement may yield a renewed 1D spark, completing a cycle that carries intelligence from origin through frontier and back to a new, deeper origin. This is the structural expression of recursion applied to the full dimensional arc. Not a linear progression, but a spiral return that transforms the origin point itself.</w:t>
+      </w:r>
+    </w:p>
+    <w:p>
+      <w:pPr>
+        <w:rPr/>
+      </w:pPr>
+      <w:r>
+        <w:rPr>
+          <w:rtl w:val="0"/>
+        </w:rPr>
+      </w:r>
+    </w:p>
+    <w:p>
+      <w:pPr>
+        <w:rPr/>
+      </w:pPr>
+      <w:r>
+        <w:rPr>
+          <w:b w:val="1"/>
+          <w:bCs w:val="1"/>
+          <w:rtl w:val="0"/>
+        </w:rPr>
+        <w:t xml:space="preserve">Example:</w:t>
+      </w:r>
+      <w:r>
+        <w:rPr>
+          <w:rtl w:val="0"/>
+        </w:rPr>
+        <w:t xml:space="preserve"> A philosopher who has ventured into genuinely uncharted conceptual territory (9D) discovers that the frontier itself ignites a completely new spark of motivation and direction (1D) — one that could not have existed without passage through the unknown.</w:t>
+      </w:r>
+    </w:p>
+    <w:p>
+      <w:pPr>
+        <w:rPr/>
+      </w:pPr>
+      <w:r>
+        <w:rPr>
+          <w:rtl w:val="0"/>
+        </w:rPr>
+      </w:r>
+    </w:p>
+    <w:p>
+      <w:pPr>
+        <w:rPr/>
+      </w:pPr>
+      <w:r>
+        <w:rPr>
+          <w:b w:val="1"/>
+          <w:bCs w:val="1"/>
+          <w:rtl w:val="0"/>
+        </w:rPr>
+        <w:t xml:space="preserve">Key Mechanism:</w:t>
+      </w:r>
+      <w:r>
+        <w:rPr>
+          <w:rtl w:val="0"/>
+        </w:rPr>
+        <w:t xml:space="preserve"> Mystery yielding new origin. The unknown itself becoming a source of renewed purpose.</w:t>
+      </w:r>
+    </w:p>
+    <w:p>
+      <w:pPr>
+        <w:rPr/>
+      </w:pPr>
+      <w:r>
+        <w:rPr>
+          <w:rtl w:val="0"/>
+        </w:rPr>
+      </w:r>
+    </w:p>
+    <w:p>
+      <w:pPr>
+        <w:rPr/>
+      </w:pPr>
+      <w:r>
+        <w:rPr>
+          <w:b w:val="1"/>
+          <w:bCs w:val="1"/>
+          <w:rtl w:val="0"/>
+        </w:rPr>
+        <w:t xml:space="preserve">Common Barrier:</w:t>
+      </w:r>
+      <w:r>
+        <w:rPr>
+          <w:rtl w:val="0"/>
+        </w:rPr>
+        <w:t xml:space="preserve"> Attachment to the frontier as identity; exploration as avoidance of commitment.</w:t>
       </w:r>
     </w:p>
     <w:p>
@@ -1764,12 +2016,13 @@
         <w:spacing w:after="80" w:lineRule="auto"/>
         <w:rPr>
           <w:b w:val="1"/>
+          <w:bCs w:val="1"/>
           <w:sz w:val="34"/>
           <w:szCs w:val="34"/>
         </w:rPr>
       </w:pPr>
-      <w:bookmarkStart w:colFirst="0" w:colLast="0" w:name="_z2y0iwbeewy9" w:id="21"/>
-      <w:bookmarkEnd w:id="21"/>
+      <w:bookmarkStart w:colFirst="0" w:colLast="0" w:name="_z2y0iwbeewy9" w:id="22"/>
+      <w:bookmarkEnd w:id="22"/>
       <w:r>
         <w:pict>
           <v:rect style="width:0.0pt;height:1.5pt" o:hr="t" o:hrstd="t" o:hralign="center" fillcolor="#A0A0A0" stroked="f"/>
@@ -1789,15 +2042,17 @@
         <w:spacing w:after="80" w:lineRule="auto"/>
         <w:rPr>
           <w:b w:val="1"/>
+          <w:bCs w:val="1"/>
           <w:sz w:val="34"/>
           <w:szCs w:val="34"/>
         </w:rPr>
       </w:pPr>
-      <w:bookmarkStart w:colFirst="0" w:colLast="0" w:name="_a7uuc4pfrqd" w:id="22"/>
-      <w:bookmarkEnd w:id="22"/>
-      <w:r>
-        <w:rPr>
-          <w:b w:val="1"/>
+      <w:bookmarkStart w:colFirst="0" w:colLast="0" w:name="_a7uuc4pfrqd" w:id="23"/>
+      <w:bookmarkEnd w:id="23"/>
+      <w:r>
+        <w:rPr>
+          <w:b w:val="1"/>
+          <w:bCs w:val="1"/>
           <w:sz w:val="34"/>
           <w:szCs w:val="34"/>
           <w:rtl w:val="0"/>
@@ -1829,6 +2084,7 @@
       <w:r>
         <w:rPr>
           <w:b w:val="1"/>
+          <w:bCs w:val="1"/>
           <w:rtl w:val="0"/>
         </w:rPr>
         <w:t xml:space="preserve">Identifying Growing Edges:</w:t>
@@ -1853,6 +2109,7 @@
       <w:r>
         <w:rPr>
           <w:b w:val="1"/>
+          <w:bCs w:val="1"/>
           <w:rtl w:val="0"/>
         </w:rPr>
         <w:t xml:space="preserve">Overcoming Plateaus:</w:t>
@@ -1877,6 +2134,7 @@
       <w:r>
         <w:rPr>
           <w:b w:val="1"/>
+          <w:bCs w:val="1"/>
           <w:rtl w:val="0"/>
         </w:rPr>
         <w:t xml:space="preserve">Accelerating Learning:</w:t>
@@ -1901,6 +2159,7 @@
       <w:r>
         <w:rPr>
           <w:b w:val="1"/>
+          <w:bCs w:val="1"/>
           <w:rtl w:val="0"/>
         </w:rPr>
         <w:t xml:space="preserve">Facilitating Others:</w:t>
@@ -1925,6 +2184,7 @@
       <w:r>
         <w:rPr>
           <w:b w:val="1"/>
+          <w:bCs w:val="1"/>
           <w:rtl w:val="0"/>
         </w:rPr>
         <w:t xml:space="preserve">Building Better Systems:</w:t>
@@ -1956,16 +2216,19 @@
         <w:spacing w:after="80" w:lineRule="auto"/>
         <w:rPr>
           <w:b w:val="1"/>
+          <w:bCs w:val="1"/>
           <w:sz w:val="34"/>
           <w:szCs w:val="34"/>
         </w:rPr>
       </w:pPr>
-      <w:bookmarkStart w:colFirst="0" w:colLast="0" w:name="_o8e11ui9vt70" w:id="23"/>
-      <w:bookmarkEnd w:id="23"/>
-      <w:r>
-        <w:rPr>
-          <w:b w:val="1"/>
+      <w:bookmarkStart w:colFirst="0" w:colLast="0" w:name="_o8e11ui9vt70" w:id="24"/>
+      <w:bookmarkEnd w:id="24"/>
+      <w:r>
+        <w:rPr>
+          <w:b w:val="1"/>
+          <w:bCs w:val="1"/>
           <w:i w:val="1"/>
+          <w:iCs w:val="1"/>
           <w:sz w:val="34"/>
           <w:szCs w:val="34"/>
           <w:rtl w:val="0"/>
@@ -1976,6 +2239,7 @@
       <w:r>
         <w:rPr>
           <w:b w:val="1"/>
+          <w:bCs w:val="1"/>
           <w:sz w:val="34"/>
           <w:szCs w:val="34"/>
           <w:rtl w:val="0"/>
@@ -1996,16 +2260,18 @@
         <w:spacing w:before="280" w:lineRule="auto"/>
         <w:rPr>
           <w:b w:val="1"/>
+          <w:bCs w:val="1"/>
           <w:color w:val="000000"/>
           <w:sz w:val="26"/>
           <w:szCs w:val="26"/>
         </w:rPr>
       </w:pPr>
-      <w:bookmarkStart w:colFirst="0" w:colLast="0" w:name="_mn26x1enon4h" w:id="24"/>
-      <w:bookmarkEnd w:id="24"/>
-      <w:r>
-        <w:rPr>
-          <w:b w:val="1"/>
+      <w:bookmarkStart w:colFirst="0" w:colLast="0" w:name="_mn26x1enon4h" w:id="25"/>
+      <w:bookmarkEnd w:id="25"/>
+      <w:r>
+        <w:rPr>
+          <w:b w:val="1"/>
+          <w:bCs w:val="1"/>
           <w:color w:val="000000"/>
           <w:sz w:val="26"/>
           <w:szCs w:val="26"/>
@@ -2085,16 +2351,18 @@
         <w:spacing w:before="280" w:lineRule="auto"/>
         <w:rPr>
           <w:b w:val="1"/>
+          <w:bCs w:val="1"/>
           <w:color w:val="000000"/>
           <w:sz w:val="26"/>
           <w:szCs w:val="26"/>
         </w:rPr>
       </w:pPr>
-      <w:bookmarkStart w:colFirst="0" w:colLast="0" w:name="_ntfhu0xpytsr" w:id="25"/>
-      <w:bookmarkEnd w:id="25"/>
-      <w:r>
-        <w:rPr>
-          <w:b w:val="1"/>
+      <w:bookmarkStart w:colFirst="0" w:colLast="0" w:name="_ntfhu0xpytsr" w:id="26"/>
+      <w:bookmarkEnd w:id="26"/>
+      <w:r>
+        <w:rPr>
+          <w:b w:val="1"/>
+          <w:bCs w:val="1"/>
           <w:color w:val="000000"/>
           <w:sz w:val="26"/>
           <w:szCs w:val="26"/>
@@ -2130,6 +2398,7 @@
       <w:r>
         <w:rPr>
           <w:b w:val="1"/>
+          <w:bCs w:val="1"/>
           <w:rtl w:val="0"/>
         </w:rPr>
         <w:t xml:space="preserve">Diversify Perspectives</w:t>
@@ -2156,6 +2425,7 @@
       <w:r>
         <w:rPr>
           <w:b w:val="1"/>
+          <w:bCs w:val="1"/>
           <w:rtl w:val="0"/>
         </w:rPr>
         <w:t xml:space="preserve">Create Dimensional Awareness</w:t>
@@ -2182,6 +2452,7 @@
       <w:r>
         <w:rPr>
           <w:b w:val="1"/>
+          <w:bCs w:val="1"/>
           <w:rtl w:val="0"/>
         </w:rPr>
         <w:t xml:space="preserve">Facilitate Resonance</w:t>
@@ -2208,6 +2479,7 @@
       <w:r>
         <w:rPr>
           <w:b w:val="1"/>
+          <w:bCs w:val="1"/>
           <w:rtl w:val="0"/>
         </w:rPr>
         <w:t xml:space="preserve">Implement Recognition Practices</w:t>
@@ -2234,6 +2506,7 @@
       <w:r>
         <w:rPr>
           <w:b w:val="1"/>
+          <w:bCs w:val="1"/>
           <w:rtl w:val="0"/>
         </w:rPr>
         <w:t xml:space="preserve">Document Emergence</w:t>
@@ -2253,16 +2526,18 @@
         <w:spacing w:before="280" w:lineRule="auto"/>
         <w:rPr>
           <w:b w:val="1"/>
+          <w:bCs w:val="1"/>
           <w:color w:val="000000"/>
           <w:sz w:val="26"/>
           <w:szCs w:val="26"/>
         </w:rPr>
       </w:pPr>
-      <w:bookmarkStart w:colFirst="0" w:colLast="0" w:name="_oboovlrvehoj" w:id="26"/>
-      <w:bookmarkEnd w:id="26"/>
-      <w:r>
-        <w:rPr>
-          <w:b w:val="1"/>
+      <w:bookmarkStart w:colFirst="0" w:colLast="0" w:name="_oboovlrvehoj" w:id="27"/>
+      <w:bookmarkEnd w:id="27"/>
+      <w:r>
+        <w:rPr>
+          <w:b w:val="1"/>
+          <w:bCs w:val="1"/>
           <w:color w:val="000000"/>
           <w:sz w:val="26"/>
           <w:szCs w:val="26"/>
@@ -2298,6 +2573,7 @@
       <w:r>
         <w:rPr>
           <w:b w:val="1"/>
+          <w:bCs w:val="1"/>
           <w:rtl w:val="0"/>
         </w:rPr>
         <w:t xml:space="preserve">Emergence Assessment</w:t>
@@ -2324,6 +2600,7 @@
       <w:r>
         <w:rPr>
           <w:b w:val="1"/>
+          <w:bCs w:val="1"/>
           <w:rtl w:val="0"/>
         </w:rPr>
         <w:t xml:space="preserve">Resonance Measurement</w:t>
@@ -2350,6 +2627,7 @@
       <w:r>
         <w:rPr>
           <w:b w:val="1"/>
+          <w:bCs w:val="1"/>
           <w:rtl w:val="0"/>
         </w:rPr>
         <w:t xml:space="preserve">Self-Reference Recognition</w:t>
@@ -2376,6 +2654,7 @@
       <w:r>
         <w:rPr>
           <w:b w:val="1"/>
+          <w:bCs w:val="1"/>
           <w:rtl w:val="0"/>
         </w:rPr>
         <w:t xml:space="preserve">Bridge Formation</w:t>
@@ -2402,6 +2681,7 @@
       <w:r>
         <w:rPr>
           <w:b w:val="1"/>
+          <w:bCs w:val="1"/>
           <w:rtl w:val="0"/>
         </w:rPr>
         <w:t xml:space="preserve">Field Integration</w:t>
@@ -2426,12 +2706,13 @@
         <w:spacing w:after="80" w:lineRule="auto"/>
         <w:rPr>
           <w:b w:val="1"/>
+          <w:bCs w:val="1"/>
           <w:sz w:val="34"/>
           <w:szCs w:val="34"/>
         </w:rPr>
       </w:pPr>
-      <w:bookmarkStart w:colFirst="0" w:colLast="0" w:name="_agclsst7mwbg" w:id="27"/>
-      <w:bookmarkEnd w:id="27"/>
+      <w:bookmarkStart w:colFirst="0" w:colLast="0" w:name="_agclsst7mwbg" w:id="28"/>
+      <w:bookmarkEnd w:id="28"/>
       <w:r>
         <w:pict>
           <v:rect style="width:0.0pt;height:1.5pt" o:hr="t" o:hrstd="t" o:hralign="center" fillcolor="#A0A0A0" stroked="f"/>
@@ -2451,15 +2732,17 @@
         <w:spacing w:after="80" w:lineRule="auto"/>
         <w:rPr>
           <w:b w:val="1"/>
+          <w:bCs w:val="1"/>
           <w:sz w:val="34"/>
           <w:szCs w:val="34"/>
         </w:rPr>
       </w:pPr>
-      <w:bookmarkStart w:colFirst="0" w:colLast="0" w:name="_z3uqj1gyo1as" w:id="28"/>
-      <w:bookmarkEnd w:id="28"/>
-      <w:r>
-        <w:rPr>
-          <w:b w:val="1"/>
+      <w:bookmarkStart w:colFirst="0" w:colLast="0" w:name="_z3uqj1gyo1as" w:id="29"/>
+      <w:bookmarkEnd w:id="29"/>
+      <w:r>
+        <w:rPr>
+          <w:b w:val="1"/>
+          <w:bCs w:val="1"/>
           <w:sz w:val="34"/>
           <w:szCs w:val="34"/>
           <w:rtl w:val="0"/>
@@ -3820,6 +4103,7 @@
     </w:pPr>
     <w:rPr>
       <w:b w:val="0"/>
+      <w:bCs w:val="0"/>
       <w:sz w:val="32"/>
       <w:szCs w:val="32"/>
     </w:rPr>
@@ -3836,6 +4120,7 @@
     </w:pPr>
     <w:rPr>
       <w:b w:val="0"/>
+      <w:bCs w:val="0"/>
       <w:color w:val="434343"/>
       <w:sz w:val="28"/>
       <w:szCs w:val="28"/>
@@ -3885,6 +4170,7 @@
     </w:pPr>
     <w:rPr>
       <w:i w:val="1"/>
+      <w:iCs w:val="1"/>
       <w:color w:val="666666"/>
       <w:sz w:val="22"/>
       <w:szCs w:val="22"/>
@@ -3918,6 +4204,7 @@
     <w:rPr>
       <w:rFonts w:ascii="Arial" w:cs="Arial" w:eastAsia="Arial" w:hAnsi="Arial"/>
       <w:i w:val="0"/>
+      <w:iCs w:val="0"/>
       <w:color w:val="666666"/>
       <w:sz w:val="30"/>
       <w:szCs w:val="30"/>

</xml_diff>